<commit_message>
Restore two-column OA certification layout
</commit_message>
<xml_diff>
--- a/Project Rooms/Operating Agreements/working/Investment Services/IS V06 - Investment Services OA Draft - from Reassembled OA Check.docx
+++ b/Project Rooms/Operating Agreements/working/Investment Services/IS V06 - Investment Services OA Draft - from Reassembled OA Check.docx
@@ -10304,213 +10304,339 @@
         <w:t>THE UNDERSIGNED, being all of the Members and Manager(s) of the Company, hereby evidence their adoption and ratification of this Amended and Restated Operating Agreement for and on the behalf of themselves and the Company, effective June ____, 2025.</w:t>
       </w:r>
     </w:p>
-    <w:p>
-      <w:r>
-        <w:rPr>
-          <w:color w:val="008000"/>
-        </w:rPr>
-      </w:r>
-    </w:p>
-    <w:p>
-      <w:r>
-        <w:rPr>
-          <w:b/>
-          <w:color w:val="008000"/>
-        </w:rPr>
-        <w:t>MEMBERS:</w:t>
-      </w:r>
-    </w:p>
-    <w:p>
-      <w:r>
-        <w:rPr>
-          <w:b/>
-          <w:color w:val="008000"/>
-        </w:rPr>
-        <w:t>Buy Your Home, LLC</w:t>
-      </w:r>
-    </w:p>
-    <w:p>
-      <w:r>
-        <w:rPr>
-          <w:color w:val="008000"/>
-        </w:rPr>
-        <w:t>By: ____________________________________</w:t>
-      </w:r>
-    </w:p>
-    <w:p>
-      <w:r>
-        <w:rPr>
-          <w:color w:val="008000"/>
-        </w:rPr>
-        <w:t>Printed Name: ___________________________</w:t>
-      </w:r>
-    </w:p>
-    <w:p>
-      <w:r>
-        <w:rPr>
-          <w:color w:val="008000"/>
-        </w:rPr>
-        <w:t>Title: __________________________________</w:t>
-      </w:r>
-    </w:p>
-    <w:p>
-      <w:r>
-        <w:rPr>
-          <w:color w:val="008000"/>
-        </w:rPr>
-      </w:r>
-    </w:p>
-    <w:p>
-      <w:r>
-        <w:rPr>
-          <w:b/>
-          <w:color w:val="008000"/>
-        </w:rPr>
-        <w:t>Sell Your Home, LLC</w:t>
-      </w:r>
-    </w:p>
-    <w:p>
-      <w:r>
-        <w:rPr>
-          <w:color w:val="008000"/>
-        </w:rPr>
-        <w:t>By: ____________________________________</w:t>
-      </w:r>
-    </w:p>
-    <w:p>
-      <w:r>
-        <w:rPr>
-          <w:color w:val="008000"/>
-        </w:rPr>
-        <w:t>Printed Name: ___________________________</w:t>
-      </w:r>
-    </w:p>
-    <w:p>
-      <w:r>
-        <w:rPr>
-          <w:color w:val="008000"/>
-        </w:rPr>
-        <w:t>Title: __________________________________</w:t>
-      </w:r>
-    </w:p>
-    <w:p>
-      <w:r>
-        <w:rPr>
-          <w:color w:val="008000"/>
-        </w:rPr>
-      </w:r>
-    </w:p>
-    <w:p>
-      <w:r>
-        <w:rPr>
-          <w:b/>
-          <w:color w:val="008000"/>
-        </w:rPr>
-        <w:t>Heritage Management LLC</w:t>
-      </w:r>
-    </w:p>
-    <w:p>
-      <w:r>
-        <w:rPr>
-          <w:color w:val="008000"/>
-        </w:rPr>
-        <w:t>By: ____________________________________</w:t>
-      </w:r>
-    </w:p>
-    <w:p>
-      <w:r>
-        <w:rPr>
-          <w:color w:val="008000"/>
-        </w:rPr>
-        <w:t>Printed Name: ___________________________</w:t>
-      </w:r>
-    </w:p>
-    <w:p>
-      <w:r>
-        <w:rPr>
-          <w:color w:val="008000"/>
-        </w:rPr>
-        <w:t>Title: __________________________________</w:t>
-      </w:r>
-    </w:p>
-    <w:p>
-      <w:r>
-        <w:rPr>
-          <w:color w:val="008000"/>
-        </w:rPr>
-      </w:r>
-    </w:p>
-    <w:p>
-      <w:r>
-        <w:rPr>
-          <w:b/>
-          <w:color w:val="008000"/>
-        </w:rPr>
-        <w:t>BYH 401K LLC</w:t>
-      </w:r>
-    </w:p>
-    <w:p>
-      <w:r>
-        <w:rPr>
-          <w:color w:val="008000"/>
-        </w:rPr>
-        <w:t>By: ____________________________________</w:t>
-      </w:r>
-    </w:p>
-    <w:p>
-      <w:r>
-        <w:rPr>
-          <w:color w:val="008000"/>
-        </w:rPr>
-        <w:t>Printed Name: ___________________________</w:t>
-      </w:r>
-    </w:p>
-    <w:p>
-      <w:r>
-        <w:rPr>
-          <w:color w:val="008000"/>
-        </w:rPr>
-        <w:t>Title: __________________________________</w:t>
-      </w:r>
-    </w:p>
-    <w:p>
-      <w:r>
-        <w:rPr>
-          <w:color w:val="008000"/>
-        </w:rPr>
-      </w:r>
-    </w:p>
-    <w:p>
-      <w:r>
-        <w:br w:type="page"/>
-      </w:r>
-    </w:p>
-    <w:p>
-      <w:r>
-        <w:rPr>
-          <w:b/>
-          <w:color w:val="008000"/>
-        </w:rPr>
-        <w:t>MANAGER:</w:t>
-      </w:r>
-    </w:p>
-    <w:p>
-      <w:r>
-        <w:rPr>
-          <w:color w:val="008000"/>
-        </w:rPr>
-        <w:t>____________________________________</w:t>
-      </w:r>
-    </w:p>
-    <w:p>
-      <w:r>
-        <w:rPr>
-          <w:b/>
-          <w:color w:val="008000"/>
-        </w:rPr>
-        <w:t>Joshua Kennedy, Manager</w:t>
-      </w:r>
-    </w:p>
+    <w:tbl>
+      <w:tblPr>
+        <w:tblW w:w="0" w:type="auto"/>
+        <w:jc w:val="center"/>
+        <w:tblLayout w:type="fixed"/>
+        <w:tblLook w:val="04A0" w:firstRow="1" w:lastRow="0" w:firstColumn="1" w:lastColumn="0" w:noHBand="0" w:noVBand="1"/>
+      </w:tblPr>
+      <w:tblGrid>
+        <w:gridCol w:w="4608"/>
+        <w:gridCol w:w="4608"/>
+      </w:tblGrid>
+      <w:tr>
+        <w:trPr>
+          <w:jc w:val="center"/>
+        </w:trPr>
+        <w:tc>
+          <w:tcPr>
+            <w:tcW w:w="4608" w:type="dxa"/>
+            <w:tcBorders>
+              <w:top w:val="nil"/>
+              <w:left w:val="nil"/>
+              <w:bottom w:val="nil"/>
+              <w:right w:val="nil"/>
+            </w:tcBorders>
+            <w:tcMar>
+              <w:top w:w="40" w:type="dxa"/>
+              <w:left w:w="80" w:type="dxa"/>
+              <w:bottom w:w="40" w:type="dxa"/>
+              <w:right w:w="80" w:type="dxa"/>
+            </w:tcMar>
+          </w:tcPr>
+          <w:p>
+            <w:pPr>
+              <w:spacing w:after="40" w:line="240" w:lineRule="auto"/>
+            </w:pPr>
+            <w:r>
+              <w:rPr>
+                <w:b/>
+                <w:color w:val="008000"/>
+              </w:rPr>
+              <w:t>MEMBER:</w:t>
+            </w:r>
+            <w:r>
+              <w:br/>
+            </w:r>
+            <w:r>
+              <w:rPr>
+                <w:b/>
+                <w:color w:val="008000"/>
+              </w:rPr>
+              <w:t>Buy Your Home, LLC</w:t>
+            </w:r>
+            <w:r>
+              <w:br/>
+            </w:r>
+            <w:r>
+              <w:rPr>
+                <w:color w:val="008000"/>
+              </w:rPr>
+              <w:t>By: ____________________________________</w:t>
+            </w:r>
+            <w:r>
+              <w:br/>
+            </w:r>
+            <w:r>
+              <w:rPr>
+                <w:color w:val="008000"/>
+              </w:rPr>
+              <w:t>Printed Name: ___________________________</w:t>
+            </w:r>
+            <w:r>
+              <w:br/>
+            </w:r>
+            <w:r>
+              <w:rPr>
+                <w:color w:val="008000"/>
+              </w:rPr>
+              <w:t>Title: __________________________________</w:t>
+            </w:r>
+          </w:p>
+        </w:tc>
+        <w:tc>
+          <w:tcPr>
+            <w:tcW w:w="4608" w:type="dxa"/>
+            <w:tcBorders>
+              <w:top w:val="nil"/>
+              <w:left w:val="nil"/>
+              <w:bottom w:val="nil"/>
+              <w:right w:val="nil"/>
+            </w:tcBorders>
+            <w:tcMar>
+              <w:top w:w="40" w:type="dxa"/>
+              <w:left w:w="80" w:type="dxa"/>
+              <w:bottom w:w="40" w:type="dxa"/>
+              <w:right w:w="80" w:type="dxa"/>
+            </w:tcMar>
+          </w:tcPr>
+          <w:p>
+            <w:pPr>
+              <w:spacing w:after="40" w:line="240" w:lineRule="auto"/>
+            </w:pPr>
+            <w:r>
+              <w:rPr>
+                <w:b/>
+                <w:color w:val="008000"/>
+              </w:rPr>
+              <w:t>MEMBER:</w:t>
+            </w:r>
+            <w:r>
+              <w:br/>
+            </w:r>
+            <w:r>
+              <w:rPr>
+                <w:b/>
+                <w:color w:val="008000"/>
+              </w:rPr>
+              <w:t>Sell Your Home, LLC</w:t>
+            </w:r>
+            <w:r>
+              <w:br/>
+            </w:r>
+            <w:r>
+              <w:rPr>
+                <w:color w:val="008000"/>
+              </w:rPr>
+              <w:t>By: ____________________________________</w:t>
+            </w:r>
+            <w:r>
+              <w:br/>
+            </w:r>
+            <w:r>
+              <w:rPr>
+                <w:color w:val="008000"/>
+              </w:rPr>
+              <w:t>Printed Name: ___________________________</w:t>
+            </w:r>
+            <w:r>
+              <w:br/>
+            </w:r>
+            <w:r>
+              <w:rPr>
+                <w:color w:val="008000"/>
+              </w:rPr>
+              <w:t>Title: __________________________________</w:t>
+            </w:r>
+          </w:p>
+        </w:tc>
+      </w:tr>
+      <w:tr>
+        <w:trPr>
+          <w:jc w:val="center"/>
+        </w:trPr>
+        <w:tc>
+          <w:tcPr>
+            <w:tcW w:w="4608" w:type="dxa"/>
+            <w:tcBorders>
+              <w:top w:val="nil"/>
+              <w:left w:val="nil"/>
+              <w:bottom w:val="nil"/>
+              <w:right w:val="nil"/>
+            </w:tcBorders>
+            <w:tcMar>
+              <w:top w:w="40" w:type="dxa"/>
+              <w:left w:w="80" w:type="dxa"/>
+              <w:bottom w:w="40" w:type="dxa"/>
+              <w:right w:w="80" w:type="dxa"/>
+            </w:tcMar>
+          </w:tcPr>
+          <w:p>
+            <w:pPr>
+              <w:spacing w:after="40" w:line="240" w:lineRule="auto"/>
+            </w:pPr>
+            <w:r>
+              <w:rPr>
+                <w:b/>
+                <w:color w:val="008000"/>
+              </w:rPr>
+              <w:t>MEMBER:</w:t>
+            </w:r>
+            <w:r>
+              <w:br/>
+            </w:r>
+            <w:r>
+              <w:rPr>
+                <w:b/>
+                <w:color w:val="008000"/>
+              </w:rPr>
+              <w:t>Heritage Management LLC</w:t>
+            </w:r>
+            <w:r>
+              <w:br/>
+            </w:r>
+            <w:r>
+              <w:rPr>
+                <w:color w:val="008000"/>
+              </w:rPr>
+              <w:t>By: ____________________________________</w:t>
+            </w:r>
+            <w:r>
+              <w:br/>
+            </w:r>
+            <w:r>
+              <w:rPr>
+                <w:color w:val="008000"/>
+              </w:rPr>
+              <w:t>Printed Name: ___________________________</w:t>
+            </w:r>
+            <w:r>
+              <w:br/>
+            </w:r>
+            <w:r>
+              <w:rPr>
+                <w:color w:val="008000"/>
+              </w:rPr>
+              <w:t>Title: __________________________________</w:t>
+            </w:r>
+          </w:p>
+        </w:tc>
+        <w:tc>
+          <w:tcPr>
+            <w:tcW w:w="4608" w:type="dxa"/>
+            <w:tcBorders>
+              <w:top w:val="nil"/>
+              <w:left w:val="nil"/>
+              <w:bottom w:val="nil"/>
+              <w:right w:val="nil"/>
+            </w:tcBorders>
+            <w:tcMar>
+              <w:top w:w="40" w:type="dxa"/>
+              <w:left w:w="80" w:type="dxa"/>
+              <w:bottom w:w="40" w:type="dxa"/>
+              <w:right w:w="80" w:type="dxa"/>
+            </w:tcMar>
+          </w:tcPr>
+          <w:p>
+            <w:pPr>
+              <w:spacing w:after="40" w:line="240" w:lineRule="auto"/>
+            </w:pPr>
+            <w:r>
+              <w:rPr>
+                <w:b/>
+                <w:color w:val="008000"/>
+              </w:rPr>
+              <w:t>MEMBER:</w:t>
+            </w:r>
+            <w:r>
+              <w:br/>
+            </w:r>
+            <w:r>
+              <w:rPr>
+                <w:b/>
+                <w:color w:val="008000"/>
+              </w:rPr>
+              <w:t>BYH 401K LLC</w:t>
+            </w:r>
+            <w:r>
+              <w:br/>
+            </w:r>
+            <w:r>
+              <w:rPr>
+                <w:color w:val="008000"/>
+              </w:rPr>
+              <w:t>By: ____________________________________</w:t>
+            </w:r>
+            <w:r>
+              <w:br/>
+            </w:r>
+            <w:r>
+              <w:rPr>
+                <w:color w:val="008000"/>
+              </w:rPr>
+              <w:t>Printed Name: ___________________________</w:t>
+            </w:r>
+            <w:r>
+              <w:br/>
+            </w:r>
+            <w:r>
+              <w:rPr>
+                <w:color w:val="008000"/>
+              </w:rPr>
+              <w:t>Title: __________________________________</w:t>
+            </w:r>
+          </w:p>
+        </w:tc>
+      </w:tr>
+      <w:tr>
+        <w:tc>
+          <w:tcPr>
+            <w:tcW w:type="dxa" w:w="4608"/>
+          </w:tcPr>
+          <w:p>
+            <w:r>
+              <w:rPr>
+                <w:b/>
+                <w:color w:val="008000"/>
+              </w:rPr>
+              <w:t>MANAGER:</w:t>
+            </w:r>
+            <w:r>
+              <w:br/>
+            </w:r>
+            <w:r>
+              <w:rPr>
+                <w:b/>
+                <w:color w:val="008000"/>
+              </w:rPr>
+              <w:t>____________________________________</w:t>
+            </w:r>
+            <w:r>
+              <w:br/>
+            </w:r>
+            <w:r>
+              <w:rPr>
+                <w:color w:val="008000"/>
+              </w:rPr>
+              <w:t>Joshua Kennedy, Manager</w:t>
+            </w:r>
+          </w:p>
+        </w:tc>
+        <w:tc>
+          <w:tcPr>
+            <w:tcW w:type="dxa" w:w="4608"/>
+          </w:tcPr>
+          <w:p>
+            <w:r>
+              <w:rPr>
+                <w:color w:val="008000"/>
+              </w:rPr>
+            </w:r>
+          </w:p>
+        </w:tc>
+      </w:tr>
+    </w:tbl>
     <w:p>
       <w:pPr>
         <w:pStyle w:val="Heading1"/>

</xml_diff>

<commit_message>
Add Investment Services member signer names
</commit_message>
<xml_diff>
--- a/Project Rooms/Operating Agreements/working/Investment Services/IS V06 - Investment Services OA Draft - from Reassembled OA Check.docx
+++ b/Project Rooms/Operating Agreements/working/Investment Services/IS V06 - Investment Services OA Draft - from Reassembled OA Check.docx
@@ -55,13 +55,7 @@
         <w:rPr>
           <w:color w:val="008000"/>
         </w:rPr>
-        <w:t xml:space="preserve"> </w:t>
-      </w:r>
-      <w:r>
-        <w:rPr>
-          <w:color w:val="008000"/>
-        </w:rPr>
-        <w:t>INVESTMENT SERVICES LLC</w:t>
+        <w:t xml:space="preserve"> INVESTMENT SERVICES LLC</w:t>
       </w:r>
     </w:p>
     <w:p>
@@ -330,7 +324,14 @@
         <w:rPr>
           <w:strike/>
         </w:rPr>
-        <w:t>Sell Your Home, LLC</w:t>
+        <w:t xml:space="preserve">Sell Your </w:t>
+      </w:r>
+      <w:r>
+        <w:rPr>
+          <w:strike/>
+        </w:rPr>
+        <w:lastRenderedPageBreak/>
+        <w:t>Home, LLC</w:t>
       </w:r>
       <w:r>
         <w:t xml:space="preserve"> </w:t>
@@ -480,13 +481,7 @@
         <w:rPr>
           <w:color w:val="008000"/>
         </w:rPr>
-        <w:t xml:space="preserve"> </w:t>
-      </w:r>
-      <w:r>
-        <w:rPr>
-          <w:color w:val="008000"/>
-        </w:rPr>
-        <w:t>Business provides services to other investment companies, including management services, signing authority, and buyer-qualification services.</w:t>
+        <w:t xml:space="preserve"> Business provides services to other investment companies, including management services, signing authority, and buyer-qualification services.</w:t>
       </w:r>
     </w:p>
     <w:p>
@@ -920,6 +915,7 @@
           <w:bCs/>
           <w:szCs w:val="24"/>
         </w:rPr>
+        <w:lastRenderedPageBreak/>
         <w:t>Special Meetings</w:t>
       </w:r>
       <w:r>
@@ -1133,7 +1129,6 @@
         <w:rPr>
           <w:szCs w:val="24"/>
         </w:rPr>
-        <w:lastRenderedPageBreak/>
         <w:t>The Company is managed by one or more Manager(s), elected annually by Members.</w:t>
       </w:r>
     </w:p>
@@ -1452,6 +1447,7 @@
           <w:bCs/>
           <w:szCs w:val="24"/>
         </w:rPr>
+        <w:lastRenderedPageBreak/>
         <w:t xml:space="preserve">Article 7 – Fiscal Matters </w:t>
       </w:r>
     </w:p>
@@ -1716,7 +1712,6 @@
           <w:bCs/>
           <w:szCs w:val="24"/>
         </w:rPr>
-        <w:lastRenderedPageBreak/>
         <w:t>Tax Treatment</w:t>
       </w:r>
       <w:r>
@@ -2073,6 +2068,7 @@
           <w:bCs/>
           <w:szCs w:val="24"/>
         </w:rPr>
+        <w:lastRenderedPageBreak/>
         <w:t>Annual Valuations</w:t>
       </w:r>
       <w:r>
@@ -2261,7 +2257,6 @@
           <w:bCs/>
           <w:szCs w:val="24"/>
         </w:rPr>
-        <w:lastRenderedPageBreak/>
         <w:t>Headings</w:t>
       </w:r>
       <w:r>
@@ -2681,6 +2676,7 @@
           <w:b/>
           <w:u w:val="single"/>
         </w:rPr>
+        <w:lastRenderedPageBreak/>
         <w:t>Inspection of Books</w:t>
       </w:r>
       <w:r>
@@ -2825,15 +2821,7 @@
           <w:bCs w:val="0"/>
           <w:color w:val="0070C0"/>
         </w:rPr>
-        <w:t xml:space="preserve">The Company can issue up to 100 Membership Units to the individuals or entities listed in Exhibit A, once full payment is received. Exhibit A shows who </w:t>
-      </w:r>
-      <w:r>
-        <w:rPr>
-          <w:bCs w:val="0"/>
-          <w:color w:val="0070C0"/>
-        </w:rPr>
-        <w:lastRenderedPageBreak/>
-        <w:t>owns how many Units and what each contributed.</w:t>
+        <w:t>The Company can issue up to 100 Membership Units to the individuals or entities listed in Exhibit A, once full payment is received. Exhibit A shows who owns how many Units and what each contributed.</w:t>
       </w:r>
     </w:p>
     <w:p>
@@ -3152,7 +3140,14 @@
         <w:rPr>
           <w:color w:val="0070C0"/>
         </w:rPr>
-        <w:t>he Members eligible to vote at a meeting are those listed at the close of business the day before the meeting notice is given—or, if no notice is given, the day before the meeting is held.</w:t>
+        <w:t xml:space="preserve">he Members eligible to vote at a meeting are those listed at the close of </w:t>
+      </w:r>
+      <w:r>
+        <w:rPr>
+          <w:color w:val="0070C0"/>
+        </w:rPr>
+        <w:lastRenderedPageBreak/>
+        <w:t>business the day before the meeting notice is given—or, if no notice is given, the day before the meeting is held.</w:t>
       </w:r>
     </w:p>
     <w:p>
@@ -3391,7 +3386,6 @@
           <w:bCs w:val="0"/>
           <w:color w:val="0070C0"/>
         </w:rPr>
-        <w:lastRenderedPageBreak/>
         <w:t>H</w:t>
       </w:r>
       <w:r>
@@ -3633,7 +3627,14 @@
         <w:rPr>
           <w:color w:val="0070C0"/>
         </w:rPr>
-        <w:t xml:space="preserve"> and requires unanimous consent from all Members. “Control” means having over 50% of the voting power or the ability to direct decisions.</w:t>
+        <w:t xml:space="preserve"> and requires unanimous </w:t>
+      </w:r>
+      <w:r>
+        <w:rPr>
+          <w:color w:val="0070C0"/>
+        </w:rPr>
+        <w:lastRenderedPageBreak/>
+        <w:t>consent from all Members. “Control” means having over 50% of the voting power or the ability to direct decisions.</w:t>
       </w:r>
     </w:p>
     <w:p>
@@ -3808,15 +3809,7 @@
           <w:bCs w:val="0"/>
           <w:color w:val="0070C0"/>
         </w:rPr>
-        <w:t xml:space="preserve">A new person can become a Member—but only if all </w:t>
-      </w:r>
-      <w:r>
-        <w:rPr>
-          <w:bCs w:val="0"/>
-          <w:color w:val="0070C0"/>
-        </w:rPr>
-        <w:lastRenderedPageBreak/>
-        <w:t>existing Members unanimously agree and set the terms together with the new Member.</w:t>
+        <w:t>A new person can become a Member—but only if all existing Members unanimously agree and set the terms together with the new Member.</w:t>
       </w:r>
     </w:p>
     <w:p>
@@ -4123,6 +4116,7 @@
         <w:rPr>
           <w:color w:val="0070C0"/>
         </w:rPr>
+        <w:lastRenderedPageBreak/>
         <w:t>If the value is more than $50,000 but not more than $250,000, payment must be made within five (5) years of closing.</w:t>
       </w:r>
     </w:p>
@@ -4710,7 +4704,14 @@
         <w:rPr>
           <w:color w:val="0070C0"/>
         </w:rPr>
-        <w:t>), the Members may use “Agreed Value” to set the price per Unit. Agreed Value means the value listed in a Certificate of Agreed Value that has been signed by all Members and filed with the Company. This certificate is only valid if all Members signed it within one year of the last signature. Members can update or create a new Certificate of Agreed Value at any time.</w:t>
+        <w:t xml:space="preserve">), the Members may use “Agreed Value” to set the price per Unit. Agreed Value means the value listed in a Certificate of </w:t>
+      </w:r>
+      <w:r>
+        <w:rPr>
+          <w:color w:val="0070C0"/>
+        </w:rPr>
+        <w:lastRenderedPageBreak/>
+        <w:t>Agreed Value that has been signed by all Members and filed with the Company. This certificate is only valid if all Members signed it within one year of the last signature. Members can update or create a new Certificate of Agreed Value at any time.</w:t>
       </w:r>
     </w:p>
     <w:p>
@@ -5019,7 +5020,14 @@
         <w:rPr>
           <w:color w:val="0070C0"/>
         </w:rPr>
-        <w:t>, they must get written notice of the meeting. The notice must state the time, date, location, and—if it’s a special meeting—the purpose. It must be given at least 10 days but no more than 60 days before the meeting. Notice can be delivered personally or by mail. If the Member is a business or trust, notice is valid if sent to the last known designated contact on record. Mailing the notice counts as delivery once it’s sent with prepaid postage.</w:t>
+        <w:t xml:space="preserve">, they must get written notice of the meeting. The notice must state the time, date, location, and—if it’s a special meeting—the purpose. It must be given at least 10 days but no more than 60 days before the meeting. Notice can be delivered personally or by mail. If the Member is a business or trust, notice </w:t>
+      </w:r>
+      <w:r>
+        <w:rPr>
+          <w:color w:val="0070C0"/>
+        </w:rPr>
+        <w:lastRenderedPageBreak/>
+        <w:t>is valid if sent to the last known designated contact on record. Mailing the notice counts as delivery once it’s sent with prepaid postage.</w:t>
       </w:r>
     </w:p>
     <w:p>
@@ -5105,14 +5113,7 @@
         <w:rPr>
           <w:color w:val="0070C0"/>
         </w:rPr>
-        <w:t xml:space="preserve">Any Manager may start and lead a Member meeting. If no Manager </w:t>
-      </w:r>
-      <w:r>
-        <w:rPr>
-          <w:color w:val="0070C0"/>
-        </w:rPr>
-        <w:lastRenderedPageBreak/>
-        <w:t>does so, the person who properly called the meeting may begin it, but a Manager will still serve as the meeting’s presiding officer.</w:t>
+        <w:t>Any Manager may start and lead a Member meeting. If no Manager does so, the person who properly called the meeting may begin it, but a Manager will still serve as the meeting’s presiding officer.</w:t>
       </w:r>
     </w:p>
     <w:p>
@@ -5527,7 +5528,6 @@
           <w:sz w:val="22"/>
           <w:szCs w:val="22"/>
         </w:rPr>
-        <w:lastRenderedPageBreak/>
         <w:t>I</w:t>
       </w:r>
       <w:r>
@@ -6245,6 +6245,7 @@
           <w:bCs w:val="0"/>
           <w:u w:val="single"/>
         </w:rPr>
+        <w:lastRenderedPageBreak/>
         <w:t>Member List and Membership Unit Record.</w:t>
       </w:r>
       <w:r>
@@ -6422,7 +6423,6 @@
     <w:p>
       <w:r>
         <w:rPr>
-          <w:strike w:val="0"/>
           <w:color w:val="008000"/>
         </w:rPr>
         <w:t>Current Manager(s). Joshua Kennedy is the current Manager of the Company and will serve until replaced, resignation, or removal under this Agreement.</w:t>
@@ -6568,7 +6568,14 @@
         <w:rPr>
           <w:color w:val="0070C0"/>
         </w:rPr>
-        <w:t xml:space="preserve">Some actions—called “Major Decisions”—cannot be made by the Manager(s) alone. These require approval from Members holding at least </w:t>
+        <w:t xml:space="preserve">Some </w:t>
+      </w:r>
+      <w:r>
+        <w:rPr>
+          <w:color w:val="0070C0"/>
+        </w:rPr>
+        <w:lastRenderedPageBreak/>
+        <w:t xml:space="preserve">actions—called “Major Decisions”—cannot be made by the Manager(s) alone. These require approval from Members holding at least </w:t>
       </w:r>
       <w:r>
         <w:rPr>
@@ -6689,7 +6696,6 @@
         <w:rPr>
           <w:color w:val="0070C0"/>
         </w:rPr>
-        <w:lastRenderedPageBreak/>
         <w:t>Selling or transferring real estate owned by the Company, or most of its assets.</w:t>
       </w:r>
     </w:p>
@@ -6756,9 +6762,6 @@
         </w:numPr>
       </w:pPr>
       <w:r>
-        <w:rPr>
-          <w:strike w:val="0"/>
-        </w:rPr>
         <w:t>Any increase or decrease in the number of Manager(s).</w:t>
       </w:r>
     </w:p>
@@ -6772,7 +6775,6 @@
           <w:ilvl w:val="3"/>
           <w:numId w:val="10"/>
         </w:numPr>
-        <w:rPr/>
       </w:pPr>
     </w:p>
     <w:p>
@@ -6868,6 +6870,7 @@
           <w:bCs w:val="0"/>
           <w:u w:val="single"/>
         </w:rPr>
+        <w:lastRenderedPageBreak/>
         <w:t>Special Meetings</w:t>
       </w:r>
       <w:r>
@@ -6984,7 +6987,6 @@
           <w:bCs w:val="0"/>
           <w:u w:val="single"/>
         </w:rPr>
-        <w:lastRenderedPageBreak/>
         <w:t>Waiver</w:t>
       </w:r>
       <w:r>
@@ -7143,7 +7145,14 @@
         <w:rPr>
           <w:color w:val="0070C0"/>
         </w:rPr>
-        <w:t>If the Company enters into a contract or transaction involving one or more of its Managers—or with another business where a Manager has a role or financial interest—that deal is not automatically invalid just because of the Manager’s involvement.</w:t>
+        <w:t xml:space="preserve">If the Company enters into a contract or transaction involving one or more of its Managers—or with another business where a Manager has a role or financial interest—that deal is not automatically invalid just because of the </w:t>
+      </w:r>
+      <w:r>
+        <w:rPr>
+          <w:color w:val="0070C0"/>
+        </w:rPr>
+        <w:lastRenderedPageBreak/>
+        <w:t>Manager’s involvement.</w:t>
       </w:r>
     </w:p>
     <w:p>
@@ -7286,7 +7295,6 @@
           <w:color w:val="auto"/>
           <w:u w:val="single"/>
         </w:rPr>
-        <w:lastRenderedPageBreak/>
         <w:t>Indemnification</w:t>
       </w:r>
     </w:p>
@@ -7445,6 +7453,7 @@
         </w:numPr>
       </w:pPr>
       <w:r>
+        <w:lastRenderedPageBreak/>
         <w:t>“Proceeding” means any threatened, pending, or completed action, suit, or proceeding, whether civil, criminal, administrative, arbitrative, or investigative, any appeal in such an action, suit, or proceeding, and any inquiry or investigation that could lead to such an action, or proceeding.</w:t>
       </w:r>
     </w:p>
@@ -7620,7 +7629,6 @@
         <w:rPr>
           <w:color w:val="0070C0"/>
         </w:rPr>
-        <w:lastRenderedPageBreak/>
         <w:t>Only if these standards are met (as determined under later sections of this Article) will indemnification be allowed.</w:t>
       </w:r>
     </w:p>
@@ -7920,6 +7928,7 @@
         <w:rPr>
           <w:color w:val="0070C0"/>
         </w:rPr>
+        <w:lastRenderedPageBreak/>
         <w:t xml:space="preserve">By a </w:t>
       </w:r>
       <w:r>
@@ -7989,7 +7998,6 @@
           <w:bCs w:val="0"/>
           <w:u w:val="single"/>
         </w:rPr>
-        <w:lastRenderedPageBreak/>
         <w:t>Authorization of Indemnification.</w:t>
       </w:r>
       <w:r>
@@ -8311,7 +8319,14 @@
         <w:rPr>
           <w:color w:val="0070C0"/>
         </w:rPr>
-        <w:t>If a former Manager is asked to appear in a legal proceeding as a witness (but is not being sued), the Company may still pay or reimburse their expenses—so long as their involvement is because of their role with the Company.</w:t>
+        <w:t xml:space="preserve">If a former Manager is asked to appear in a legal proceeding as a </w:t>
+      </w:r>
+      <w:r>
+        <w:rPr>
+          <w:color w:val="0070C0"/>
+        </w:rPr>
+        <w:lastRenderedPageBreak/>
+        <w:t>witness (but is not being sued), the Company may still pay or reimburse their expenses—so long as their involvement is because of their role with the Company.</w:t>
       </w:r>
     </w:p>
     <w:p>
@@ -8392,14 +8407,7 @@
         <w:rPr>
           <w:color w:val="0070C0"/>
         </w:rPr>
-        <w:t xml:space="preserve">The Company may also advance legal expenses to non-employees and non-agents who served at the Company’s request in a leadership or </w:t>
-      </w:r>
-      <w:r>
-        <w:rPr>
-          <w:color w:val="0070C0"/>
-        </w:rPr>
-        <w:lastRenderedPageBreak/>
-        <w:t>representative role for another organization</w:t>
+        <w:t>The Company may also advance legal expenses to non-employees and non-agents who served at the Company’s request in a leadership or representative role for another organization</w:t>
       </w:r>
       <w:r>
         <w:rPr>
@@ -8696,6 +8704,7 @@
         <w:rPr>
           <w:color w:val="0070C0"/>
         </w:rPr>
+        <w:lastRenderedPageBreak/>
         <w:t>The Company must keep a Capital Account for each Member. This account tracks cash and property contributed, profits and losses allocated, and distributions received. It follows tax rules and adjusts for certain IRS provisions, but Members aren’t affected by all tax basis changes</w:t>
       </w:r>
       <w:r>
@@ -8739,7 +8748,6 @@
         <w:rPr>
           <w:color w:val="0070C0"/>
         </w:rPr>
-        <w:lastRenderedPageBreak/>
         <w:t>A Member may demand a return of their Capital Contribution only at dissolution or as otherwise allowed by law—and only in cash.</w:t>
       </w:r>
     </w:p>
@@ -9102,7 +9110,14 @@
         <w:rPr>
           <w:color w:val="0070C0"/>
         </w:rPr>
-        <w:t>The Company and other Members are not responsible for any debts or obligations incurred by an individual Member or their affiliates. If such debts cause liability to the Company or others, the responsible Member must reimburse and protect them from harm.</w:t>
+        <w:t xml:space="preserve">The Company and other Members are not responsible for any debts or obligations incurred by an individual Member or their affiliates. If such debts </w:t>
+      </w:r>
+      <w:r>
+        <w:rPr>
+          <w:color w:val="0070C0"/>
+        </w:rPr>
+        <w:lastRenderedPageBreak/>
+        <w:t>cause liability to the Company or others, the responsible Member must reimburse and protect them from harm.</w:t>
       </w:r>
     </w:p>
     <w:p>
@@ -9534,6 +9549,7 @@
           <w:color w:val="0070C0"/>
           <w:sz w:val="22"/>
         </w:rPr>
+        <w:lastRenderedPageBreak/>
         <w:t>First, to pay Company debts and liquidation expenses, including amounts owed to Members for expenses or approved transactions.</w:t>
       </w:r>
     </w:p>
@@ -9624,15 +9640,7 @@
           <w:color w:val="0070C0"/>
           <w:sz w:val="22"/>
         </w:rPr>
-        <w:t xml:space="preserve">Fifth, any remaining assets are distributed to Members based on their percentage </w:t>
-      </w:r>
-      <w:r>
-        <w:rPr>
-          <w:color w:val="0070C0"/>
-          <w:sz w:val="22"/>
-        </w:rPr>
-        <w:lastRenderedPageBreak/>
-        <w:t>of Membership Units."</w:t>
+        <w:t>Fifth, any remaining assets are distributed to Members based on their percentage of Membership Units."</w:t>
       </w:r>
     </w:p>
     <w:p>
@@ -9873,12 +9881,11 @@
           <w:bCs w:val="0"/>
         </w:rPr>
       </w:pPr>
-      <w:commentRangeStart w:id="9"/>
-      <w:commentRangeEnd w:id="9"/>
       <w:r>
         <w:rPr>
           <w:strike/>
         </w:rPr>
+        <w:lastRenderedPageBreak/>
         <w:t>Required Minimum Distributions.  ( I would rather prohibit accounts that require RMD) If an IRA Member’s Account Holder is subject to required minimum distributions (RMDs), they must either rely on other IRAs or ensure enough cash is available in their IRA to meet those RMDs. The Company cannot guarantee that its distributions will align with RMD timing.</w:t>
       </w:r>
     </w:p>
@@ -9949,7 +9956,6 @@
           <w:bCs w:val="0"/>
           <w:u w:val="single"/>
         </w:rPr>
-        <w:lastRenderedPageBreak/>
         <w:t>Company Seal.</w:t>
       </w:r>
       <w:r>
@@ -10372,7 +10378,7 @@
               <w:rPr>
                 <w:color w:val="008000"/>
               </w:rPr>
-              <w:t>Printed Name: ___________________________</w:t>
+              <w:t>Printed Name: Wesley Dale Browning</w:t>
             </w:r>
             <w:r>
               <w:br/>
@@ -10438,7 +10444,7 @@
               <w:rPr>
                 <w:color w:val="008000"/>
               </w:rPr>
-              <w:t>Printed Name: ___________________________</w:t>
+              <w:t>Printed Name: Joshua Kennedy</w:t>
             </w:r>
             <w:r>
               <w:br/>
@@ -10509,7 +10515,7 @@
               <w:rPr>
                 <w:color w:val="008000"/>
               </w:rPr>
-              <w:t>Printed Name: ___________________________</w:t>
+              <w:t>Printed Name: Wesley Dale Browning</w:t>
             </w:r>
             <w:r>
               <w:br/>
@@ -10575,7 +10581,7 @@
               <w:rPr>
                 <w:color w:val="008000"/>
               </w:rPr>
-              <w:t>Printed Name: ___________________________</w:t>
+              <w:t>Printed Name: Wesley Dale Browning</w:t>
             </w:r>
             <w:r>
               <w:br/>
@@ -10590,9 +10596,12 @@
         </w:tc>
       </w:tr>
       <w:tr>
+        <w:trPr>
+          <w:jc w:val="center"/>
+        </w:trPr>
         <w:tc>
           <w:tcPr>
-            <w:tcW w:type="dxa" w:w="4608"/>
+            <w:tcW w:w="4608" w:type="dxa"/>
           </w:tcPr>
           <w:p>
             <w:r>
@@ -10625,15 +10634,9 @@
         </w:tc>
         <w:tc>
           <w:tcPr>
-            <w:tcW w:type="dxa" w:w="4608"/>
+            <w:tcW w:w="4608" w:type="dxa"/>
           </w:tcPr>
-          <w:p>
-            <w:r>
-              <w:rPr>
-                <w:color w:val="008000"/>
-              </w:rPr>
-            </w:r>
-          </w:p>
+          <w:p/>
         </w:tc>
       </w:tr>
     </w:tbl>
@@ -10669,8 +10672,8 @@
         <w:tblLook w:val="04A0" w:firstRow="1" w:lastRow="0" w:firstColumn="1" w:lastColumn="0" w:noHBand="0" w:noVBand="1"/>
       </w:tblPr>
       <w:tblGrid>
-        <w:gridCol w:w="3734"/>
-        <w:gridCol w:w="1667"/>
+        <w:gridCol w:w="4068"/>
+        <w:gridCol w:w="1333"/>
       </w:tblGrid>
       <w:tr>
         <w:trPr>
@@ -11048,12 +11051,12 @@
     <w:p>
       <w:pPr>
         <w:sectPr>
-          <w:headerReference w:type="even" r:id="rId15"/>
-          <w:headerReference w:type="default" r:id="rId16"/>
-          <w:footerReference w:type="even" r:id="rId17"/>
-          <w:footerReference w:type="default" r:id="rId18"/>
-          <w:headerReference w:type="first" r:id="rId19"/>
-          <w:footerReference w:type="first" r:id="rId20"/>
+          <w:headerReference w:type="even" r:id="rId11"/>
+          <w:headerReference w:type="default" r:id="rId12"/>
+          <w:footerReference w:type="even" r:id="rId13"/>
+          <w:footerReference w:type="default" r:id="rId14"/>
+          <w:headerReference w:type="first" r:id="rId15"/>
+          <w:footerReference w:type="first" r:id="rId16"/>
           <w:pgSz w:w="12240" w:h="15840"/>
           <w:pgMar w:top="1440" w:right="1440" w:bottom="1440" w:left="1440" w:header="720" w:footer="720" w:gutter="0"/>
           <w:cols w:space="720"/>
@@ -11126,8 +11129,8 @@
       </w:r>
     </w:p>
     <w:sectPr>
-      <w:headerReference w:type="default" r:id="rId21"/>
-      <w:footerReference w:type="default" r:id="rId22"/>
+      <w:headerReference w:type="default" r:id="rId17"/>
+      <w:footerReference w:type="default" r:id="rId18"/>
       <w:pgSz w:w="12240" w:h="15840"/>
       <w:pgMar w:top="1440" w:right="1440" w:bottom="1440" w:left="1440" w:header="720" w:footer="720" w:gutter="0"/>
       <w:cols w:space="720"/>
@@ -11135,45 +11138,6 @@
     </w:sectPr>
   </w:body>
 </w:document>
-</file>
-
-<file path=word/comments.xml><?xml version="1.0" encoding="utf-8"?>
-<w:comments xmlns:wpc="http://schemas.microsoft.com/office/word/2010/wordprocessingCanvas" xmlns:cx="http://schemas.microsoft.com/office/drawing/2014/chartex" xmlns:cx1="http://schemas.microsoft.com/office/drawing/2015/9/8/chartex" xmlns:cx2="http://schemas.microsoft.com/office/drawing/2015/10/21/chartex" xmlns:cx3="http://schemas.microsoft.com/office/drawing/2016/5/9/chartex" xmlns:cx4="http://schemas.microsoft.com/office/drawing/2016/5/10/chartex" xmlns:cx5="http://schemas.microsoft.com/office/drawing/2016/5/11/chartex" xmlns:cx6="http://schemas.microsoft.com/office/drawing/2016/5/12/chartex" xmlns:cx7="http://schemas.microsoft.com/office/drawing/2016/5/13/chartex" xmlns:cx8="http://schemas.microsoft.com/office/drawing/2016/5/14/chartex" xmlns:mc="http://schemas.openxmlformats.org/markup-compatibility/2006" xmlns:aink="http://schemas.microsoft.com/office/drawing/2016/ink" xmlns:am3d="http://schemas.microsoft.com/office/drawing/2017/model3d" xmlns:o="urn:schemas-microsoft-com:office:office" xmlns:oel="http://schemas.microsoft.com/office/2019/extlst" xmlns:r="http://schemas.openxmlformats.org/officeDocument/2006/relationships" xmlns:m="http://schemas.openxmlformats.org/officeDocument/2006/math" xmlns:v="urn:schemas-microsoft-com:vml" xmlns:wp14="http://schemas.microsoft.com/office/word/2010/wordprocessingDrawing" xmlns:wp="http://schemas.openxmlformats.org/drawingml/2006/wordprocessingDrawing" xmlns:w10="urn:schemas-microsoft-com:office:word" xmlns:w="http://schemas.openxmlformats.org/wordprocessingml/2006/main" xmlns:w14="http://schemas.microsoft.com/office/word/2010/wordml" xmlns:w15="http://schemas.microsoft.com/office/word/2012/wordml" xmlns:w16cex="http://schemas.microsoft.com/office/word/2018/wordml/cex" xmlns:w16cid="http://schemas.microsoft.com/office/word/2016/wordml/cid" xmlns:w16="http://schemas.microsoft.com/office/word/2018/wordml" xmlns:w16du="http://schemas.microsoft.com/office/word/2023/wordml/word16du" xmlns:w16sdtdh="http://schemas.microsoft.com/office/word/2020/wordml/sdtdatahash" xmlns:w16sdtfl="http://schemas.microsoft.com/office/word/2024/wordml/sdtformatlock" xmlns:w16se="http://schemas.microsoft.com/office/word/2015/wordml/symex" xmlns:wpg="http://schemas.microsoft.com/office/word/2010/wordprocessingGroup" xmlns:wpi="http://schemas.microsoft.com/office/word/2010/wordprocessingInk" xmlns:wne="http://schemas.microsoft.com/office/word/2006/wordml" xmlns:wps="http://schemas.microsoft.com/office/word/2010/wordprocessingShape" mc:Ignorable="w14 w15 w16se w16cid w16 w16cex w16sdtdh w16sdtfl w16du wp14">
-  <w:comment w:id="9" w:author="Jeff Watson" w:date="2025-10-31T12:48:00Z" w:initials="JW">
-    <w:p>
-      <w:pPr>
-        <w:pStyle w:val="CommentText"/>
-      </w:pPr>
-      <w:r>
-        <w:rPr>
-          <w:rStyle w:val="CommentReference"/>
-        </w:rPr>
-        <w:annotationRef/>
-      </w:r>
-      <w:r>
-        <w:t xml:space="preserve">Those accounts are Trad IRAs and Trad SEPs and Simples None of which are or can become owners </w:t>
-      </w:r>
-    </w:p>
-  </w:comment>
-</w:comments>
-</file>
-
-<file path=word/commentsExtended.xml><?xml version="1.0" encoding="utf-8"?>
-<w15:commentsEx xmlns:wpc="http://schemas.microsoft.com/office/word/2010/wordprocessingCanvas" xmlns:cx="http://schemas.microsoft.com/office/drawing/2014/chartex" xmlns:cx1="http://schemas.microsoft.com/office/drawing/2015/9/8/chartex" xmlns:cx2="http://schemas.microsoft.com/office/drawing/2015/10/21/chartex" xmlns:cx3="http://schemas.microsoft.com/office/drawing/2016/5/9/chartex" xmlns:cx4="http://schemas.microsoft.com/office/drawing/2016/5/10/chartex" xmlns:cx5="http://schemas.microsoft.com/office/drawing/2016/5/11/chartex" xmlns:cx6="http://schemas.microsoft.com/office/drawing/2016/5/12/chartex" xmlns:cx7="http://schemas.microsoft.com/office/drawing/2016/5/13/chartex" xmlns:cx8="http://schemas.microsoft.com/office/drawing/2016/5/14/chartex" xmlns:mc="http://schemas.openxmlformats.org/markup-compatibility/2006" xmlns:aink="http://schemas.microsoft.com/office/drawing/2016/ink" xmlns:am3d="http://schemas.microsoft.com/office/drawing/2017/model3d" xmlns:o="urn:schemas-microsoft-com:office:office" xmlns:oel="http://schemas.microsoft.com/office/2019/extlst" xmlns:r="http://schemas.openxmlformats.org/officeDocument/2006/relationships" xmlns:m="http://schemas.openxmlformats.org/officeDocument/2006/math" xmlns:v="urn:schemas-microsoft-com:vml" xmlns:wp14="http://schemas.microsoft.com/office/word/2010/wordprocessingDrawing" xmlns:wp="http://schemas.openxmlformats.org/drawingml/2006/wordprocessingDrawing" xmlns:w10="urn:schemas-microsoft-com:office:word" xmlns:w="http://schemas.openxmlformats.org/wordprocessingml/2006/main" xmlns:w14="http://schemas.microsoft.com/office/word/2010/wordml" xmlns:w15="http://schemas.microsoft.com/office/word/2012/wordml" xmlns:w16cex="http://schemas.microsoft.com/office/word/2018/wordml/cex" xmlns:w16cid="http://schemas.microsoft.com/office/word/2016/wordml/cid" xmlns:w16="http://schemas.microsoft.com/office/word/2018/wordml" xmlns:w16du="http://schemas.microsoft.com/office/word/2023/wordml/word16du" xmlns:w16sdtdh="http://schemas.microsoft.com/office/word/2020/wordml/sdtdatahash" xmlns:w16sdtfl="http://schemas.microsoft.com/office/word/2024/wordml/sdtformatlock" xmlns:w16se="http://schemas.microsoft.com/office/word/2015/wordml/symex" xmlns:wpg="http://schemas.microsoft.com/office/word/2010/wordprocessingGroup" xmlns:wpi="http://schemas.microsoft.com/office/word/2010/wordprocessingInk" xmlns:wne="http://schemas.microsoft.com/office/word/2006/wordml" xmlns:wps="http://schemas.microsoft.com/office/word/2010/wordprocessingShape" mc:Ignorable="w14 w15 w16se w16cid w16 w16cex w16sdtdh w16sdtfl w16du wp14">
-  <w15:commentEx w15:paraId="4F17A606" w15:done="0"/>
-</w15:commentsEx>
-</file>
-
-<file path=word/commentsExtensible.xml><?xml version="1.0" encoding="utf-8"?>
-<w16cex:commentsExtensible xmlns:wpc="http://schemas.microsoft.com/office/word/2010/wordprocessingCanvas" xmlns:cx="http://schemas.microsoft.com/office/drawing/2014/chartex" xmlns:cx1="http://schemas.microsoft.com/office/drawing/2015/9/8/chartex" xmlns:cx2="http://schemas.microsoft.com/office/drawing/2015/10/21/chartex" xmlns:cx3="http://schemas.microsoft.com/office/drawing/2016/5/9/chartex" xmlns:cx4="http://schemas.microsoft.com/office/drawing/2016/5/10/chartex" xmlns:cx5="http://schemas.microsoft.com/office/drawing/2016/5/11/chartex" xmlns:cx6="http://schemas.microsoft.com/office/drawing/2016/5/12/chartex" xmlns:cx7="http://schemas.microsoft.com/office/drawing/2016/5/13/chartex" xmlns:cx8="http://schemas.microsoft.com/office/drawing/2016/5/14/chartex" xmlns:cr="http://schemas.microsoft.com/office/comments/2020/reactions" xmlns:mc="http://schemas.openxmlformats.org/markup-compatibility/2006" xmlns:aink="http://schemas.microsoft.com/office/drawing/2016/ink" xmlns:am3d="http://schemas.microsoft.com/office/drawing/2017/model3d" xmlns:o="urn:schemas-microsoft-com:office:office" xmlns:oel="http://schemas.microsoft.com/office/2019/extlst" xmlns:r="http://schemas.openxmlformats.org/officeDocument/2006/relationships" xmlns:m="http://schemas.openxmlformats.org/officeDocument/2006/math" xmlns:v="urn:schemas-microsoft-com:vml" xmlns:wp14="http://schemas.microsoft.com/office/word/2010/wordprocessingDrawing" xmlns:wp="http://schemas.openxmlformats.org/drawingml/2006/wordprocessingDrawing" xmlns:w10="urn:schemas-microsoft-com:office:word" xmlns:w="http://schemas.openxmlformats.org/wordprocessingml/2006/main" xmlns:w14="http://schemas.microsoft.com/office/word/2010/wordml" xmlns:w15="http://schemas.microsoft.com/office/word/2012/wordml" xmlns:w16cex="http://schemas.microsoft.com/office/word/2018/wordml/cex" xmlns:w16cid="http://schemas.microsoft.com/office/word/2016/wordml/cid" xmlns:w16="http://schemas.microsoft.com/office/word/2018/wordml" xmlns:w16du="http://schemas.microsoft.com/office/word/2023/wordml/word16du" xmlns:w16sdtdh="http://schemas.microsoft.com/office/word/2020/wordml/sdtdatahash" xmlns:w16sdtfl="http://schemas.microsoft.com/office/word/2024/wordml/sdtformatlock" xmlns:w16se="http://schemas.microsoft.com/office/word/2015/wordml/symex" xmlns:wpg="http://schemas.microsoft.com/office/word/2010/wordprocessingGroup" xmlns:wpi="http://schemas.microsoft.com/office/word/2010/wordprocessingInk" xmlns:wne="http://schemas.microsoft.com/office/word/2006/wordml" xmlns:wps="http://schemas.microsoft.com/office/word/2010/wordprocessingShape" mc:Ignorable="w14 w15 w16se w16cid w16 w16cex w16sdtdh w16sdtfl cr w16du wp14">
-  <w16cex:commentExtensible w16cex:durableId="54E6775F" w16cex:dateUtc="2025-10-31T16:48:00Z"/>
-</w16cex:commentsExtensible>
-</file>
-
-<file path=word/commentsIds.xml><?xml version="1.0" encoding="utf-8"?>
-<w16cid:commentsIds xmlns:wpc="http://schemas.microsoft.com/office/word/2010/wordprocessingCanvas" xmlns:cx="http://schemas.microsoft.com/office/drawing/2014/chartex" xmlns:cx1="http://schemas.microsoft.com/office/drawing/2015/9/8/chartex" xmlns:cx2="http://schemas.microsoft.com/office/drawing/2015/10/21/chartex" xmlns:cx3="http://schemas.microsoft.com/office/drawing/2016/5/9/chartex" xmlns:cx4="http://schemas.microsoft.com/office/drawing/2016/5/10/chartex" xmlns:cx5="http://schemas.microsoft.com/office/drawing/2016/5/11/chartex" xmlns:cx6="http://schemas.microsoft.com/office/drawing/2016/5/12/chartex" xmlns:cx7="http://schemas.microsoft.com/office/drawing/2016/5/13/chartex" xmlns:cx8="http://schemas.microsoft.com/office/drawing/2016/5/14/chartex" xmlns:mc="http://schemas.openxmlformats.org/markup-compatibility/2006" xmlns:aink="http://schemas.microsoft.com/office/drawing/2016/ink" xmlns:am3d="http://schemas.microsoft.com/office/drawing/2017/model3d" xmlns:o="urn:schemas-microsoft-com:office:office" xmlns:oel="http://schemas.microsoft.com/office/2019/extlst" xmlns:r="http://schemas.openxmlformats.org/officeDocument/2006/relationships" xmlns:m="http://schemas.openxmlformats.org/officeDocument/2006/math" xmlns:v="urn:schemas-microsoft-com:vml" xmlns:wp14="http://schemas.microsoft.com/office/word/2010/wordprocessingDrawing" xmlns:wp="http://schemas.openxmlformats.org/drawingml/2006/wordprocessingDrawing" xmlns:w10="urn:schemas-microsoft-com:office:word" xmlns:w="http://schemas.openxmlformats.org/wordprocessingml/2006/main" xmlns:w14="http://schemas.microsoft.com/office/word/2010/wordml" xmlns:w15="http://schemas.microsoft.com/office/word/2012/wordml" xmlns:w16cex="http://schemas.microsoft.com/office/word/2018/wordml/cex" xmlns:w16cid="http://schemas.microsoft.com/office/word/2016/wordml/cid" xmlns:w16="http://schemas.microsoft.com/office/word/2018/wordml" xmlns:w16du="http://schemas.microsoft.com/office/word/2023/wordml/word16du" xmlns:w16sdtdh="http://schemas.microsoft.com/office/word/2020/wordml/sdtdatahash" xmlns:w16sdtfl="http://schemas.microsoft.com/office/word/2024/wordml/sdtformatlock" xmlns:w16se="http://schemas.microsoft.com/office/word/2015/wordml/symex" xmlns:wpg="http://schemas.microsoft.com/office/word/2010/wordprocessingGroup" xmlns:wpi="http://schemas.microsoft.com/office/word/2010/wordprocessingInk" xmlns:wne="http://schemas.microsoft.com/office/word/2006/wordml" xmlns:wps="http://schemas.microsoft.com/office/word/2010/wordprocessingShape" mc:Ignorable="w14 w15 w16se w16cid w16 w16cex w16sdtdh w16sdtfl w16du wp14">
-  <w16cid:commentId w16cid:paraId="4F17A606" w16cid:durableId="54E6775F"/>
-</w16cid:commentsIds>
 </file>
 
 <file path=word/endnotes.xml><?xml version="1.0" encoding="utf-8"?>
@@ -11273,9 +11237,17 @@
     </w:r>
     <w:r>
       <w:fldChar w:fldCharType="begin"/>
+    </w:r>
+    <w:r>
       <w:instrText xml:space="preserve"> PAGE </w:instrText>
+    </w:r>
+    <w:r>
       <w:fldChar w:fldCharType="separate"/>
+    </w:r>
+    <w:r>
       <w:t>1</w:t>
+    </w:r>
+    <w:r>
       <w:fldChar w:fldCharType="end"/>
     </w:r>
     <w:r>
@@ -13522,17 +13494,6 @@
   </w:num>
   <w:numIdMacAtCleanup w:val="21"/>
 </w:numbering>
-</file>
-
-<file path=word/people.xml><?xml version="1.0" encoding="utf-8"?>
-<w15:people xmlns:wpc="http://schemas.microsoft.com/office/word/2010/wordprocessingCanvas" xmlns:cx="http://schemas.microsoft.com/office/drawing/2014/chartex" xmlns:cx1="http://schemas.microsoft.com/office/drawing/2015/9/8/chartex" xmlns:cx2="http://schemas.microsoft.com/office/drawing/2015/10/21/chartex" xmlns:cx3="http://schemas.microsoft.com/office/drawing/2016/5/9/chartex" xmlns:cx4="http://schemas.microsoft.com/office/drawing/2016/5/10/chartex" xmlns:cx5="http://schemas.microsoft.com/office/drawing/2016/5/11/chartex" xmlns:cx6="http://schemas.microsoft.com/office/drawing/2016/5/12/chartex" xmlns:cx7="http://schemas.microsoft.com/office/drawing/2016/5/13/chartex" xmlns:cx8="http://schemas.microsoft.com/office/drawing/2016/5/14/chartex" xmlns:mc="http://schemas.openxmlformats.org/markup-compatibility/2006" xmlns:aink="http://schemas.microsoft.com/office/drawing/2016/ink" xmlns:am3d="http://schemas.microsoft.com/office/drawing/2017/model3d" xmlns:o="urn:schemas-microsoft-com:office:office" xmlns:oel="http://schemas.microsoft.com/office/2019/extlst" xmlns:r="http://schemas.openxmlformats.org/officeDocument/2006/relationships" xmlns:m="http://schemas.openxmlformats.org/officeDocument/2006/math" xmlns:v="urn:schemas-microsoft-com:vml" xmlns:wp14="http://schemas.microsoft.com/office/word/2010/wordprocessingDrawing" xmlns:wp="http://schemas.openxmlformats.org/drawingml/2006/wordprocessingDrawing" xmlns:w10="urn:schemas-microsoft-com:office:word" xmlns:w="http://schemas.openxmlformats.org/wordprocessingml/2006/main" xmlns:w14="http://schemas.microsoft.com/office/word/2010/wordml" xmlns:w15="http://schemas.microsoft.com/office/word/2012/wordml" xmlns:w16cex="http://schemas.microsoft.com/office/word/2018/wordml/cex" xmlns:w16cid="http://schemas.microsoft.com/office/word/2016/wordml/cid" xmlns:w16="http://schemas.microsoft.com/office/word/2018/wordml" xmlns:w16du="http://schemas.microsoft.com/office/word/2023/wordml/word16du" xmlns:w16sdtdh="http://schemas.microsoft.com/office/word/2020/wordml/sdtdatahash" xmlns:w16sdtfl="http://schemas.microsoft.com/office/word/2024/wordml/sdtformatlock" xmlns:w16se="http://schemas.microsoft.com/office/word/2015/wordml/symex" xmlns:wpg="http://schemas.microsoft.com/office/word/2010/wordprocessingGroup" xmlns:wpi="http://schemas.microsoft.com/office/word/2010/wordprocessingInk" xmlns:wne="http://schemas.microsoft.com/office/word/2006/wordml" xmlns:wps="http://schemas.microsoft.com/office/word/2010/wordprocessingShape" mc:Ignorable="w14 w15 w16se w16cid w16 w16cex w16sdtdh w16sdtfl w16du wp14">
-  <w15:person w15:author="Wes Will Buy Your Home">
-    <w15:presenceInfo w15:providerId="AD" w15:userId="S::WesWill@BuyYourHomeLLC.com::f11e14ef-79d4-4c0c-9ca8-f8d663a0e563"/>
-  </w15:person>
-  <w15:person w15:author="Jeff Watson">
-    <w15:presenceInfo w15:providerId="Windows Live" w15:userId="dcdb38203bf7a9b9"/>
-  </w15:person>
-</w15:people>
 </file>
 
 <file path=word/styles.xml><?xml version="1.0" encoding="utf-8"?>
@@ -25349,6 +25310,15 @@
 </file>
 
 <file path=customXml/item1.xml><?xml version="1.0" encoding="utf-8"?>
+<?mso-contentType ?>
+<FormTemplates xmlns="http://schemas.microsoft.com/sharepoint/v3/contenttype/forms">
+  <Display>DocumentLibraryForm</Display>
+  <Edit>DocumentLibraryForm</Edit>
+  <New>DocumentLibraryForm</New>
+</FormTemplates>
+</file>
+
+<file path=customXml/item2.xml><?xml version="1.0" encoding="utf-8"?>
 <ct:contentTypeSchema xmlns:ct="http://schemas.microsoft.com/office/2006/metadata/contentType" xmlns:ma="http://schemas.microsoft.com/office/2006/metadata/properties/metaAttributes" ct:_="" ma:_="" ma:contentTypeName="Document" ma:contentTypeID="0x010100DDC7FDB1C8256C4EA4678CC05D188078" ma:contentTypeVersion="20" ma:contentTypeDescription="Create a new document." ma:contentTypeScope="" ma:versionID="2a9650d830cc67299a1a440994d8139a">
   <xsd:schema xmlns:xsd="http://www.w3.org/2001/XMLSchema" xmlns:xs="http://www.w3.org/2001/XMLSchema" xmlns:p="http://schemas.microsoft.com/office/2006/metadata/properties" xmlns:ns2="ab9fedca-001d-4cc9-b244-d9c3be5a27d3" xmlns:ns3="42cc25d9-27fe-4f07-accb-ded05ec47eee" targetNamespace="http://schemas.microsoft.com/office/2006/metadata/properties" ma:root="true" ma:fieldsID="b7be75ccca685a650eabb79854d6018f" ns2:_="" ns3:_="">
     <xsd:import namespace="ab9fedca-001d-4cc9-b244-d9c3be5a27d3"/>
@@ -25615,16 +25585,11 @@
 </ct:contentTypeSchema>
 </file>
 
-<file path=customXml/item2.xml><?xml version="1.0" encoding="utf-8"?>
-<?mso-contentType ?>
-<FormTemplates xmlns="http://schemas.microsoft.com/sharepoint/v3/contenttype/forms">
-  <Display>DocumentLibraryForm</Display>
-  <Edit>DocumentLibraryForm</Edit>
-  <New>DocumentLibraryForm</New>
-</FormTemplates>
+<file path=customXml/item3.xml><?xml version="1.0" encoding="utf-8"?>
+<b:Sources xmlns:b="http://schemas.openxmlformats.org/officeDocument/2006/bibliography" xmlns="http://schemas.openxmlformats.org/officeDocument/2006/bibliography" SelectedStyle="/APA.XSL" StyleName="APA"/>
 </file>
 
-<file path=customXml/item3.xml><?xml version="1.0" encoding="utf-8"?>
+<file path=customXml/item4.xml><?xml version="1.0" encoding="utf-8"?>
 <p:properties xmlns:p="http://schemas.microsoft.com/office/2006/metadata/properties" xmlns:xsi="http://www.w3.org/2001/XMLSchema-instance" xmlns:pc="http://schemas.microsoft.com/office/infopath/2007/PartnerControls">
   <documentManagement>
     <TaxCatchAll xmlns="42cc25d9-27fe-4f07-accb-ded05ec47eee" xsi:nil="true"/>
@@ -25636,11 +25601,15 @@
 </p:properties>
 </file>
 
-<file path=customXml/item4.xml><?xml version="1.0" encoding="utf-8"?>
-<b:Sources xmlns:b="http://schemas.openxmlformats.org/officeDocument/2006/bibliography" xmlns="http://schemas.openxmlformats.org/officeDocument/2006/bibliography" SelectedStyle="/APA.XSL" StyleName="APA"/>
+<file path=customXml/itemProps1.xml><?xml version="1.0" encoding="utf-8"?>
+<ds:datastoreItem xmlns:ds="http://schemas.openxmlformats.org/officeDocument/2006/customXml" ds:itemID="{8FB87CE3-B469-4182-AEDE-9227E391BD91}">
+  <ds:schemaRefs>
+    <ds:schemaRef ds:uri="http://schemas.microsoft.com/sharepoint/v3/contenttype/forms"/>
+  </ds:schemaRefs>
+</ds:datastoreItem>
 </file>
 
-<file path=customXml/itemProps1.xml><?xml version="1.0" encoding="utf-8"?>
+<file path=customXml/itemProps2.xml><?xml version="1.0" encoding="utf-8"?>
 <ds:datastoreItem xmlns:ds="http://schemas.openxmlformats.org/officeDocument/2006/customXml" ds:itemID="{E1A392CF-E3E2-49C9-9EED-3BECD1E5A0F6}">
   <ds:schemaRefs>
     <ds:schemaRef ds:uri="http://schemas.microsoft.com/office/2006/metadata/contentType"/>
@@ -25659,15 +25628,15 @@
 </ds:datastoreItem>
 </file>
 
-<file path=customXml/itemProps2.xml><?xml version="1.0" encoding="utf-8"?>
-<ds:datastoreItem xmlns:ds="http://schemas.openxmlformats.org/officeDocument/2006/customXml" ds:itemID="{8FB87CE3-B469-4182-AEDE-9227E391BD91}">
+<file path=customXml/itemProps3.xml><?xml version="1.0" encoding="utf-8"?>
+<ds:datastoreItem xmlns:ds="http://schemas.openxmlformats.org/officeDocument/2006/customXml" ds:itemID="{EF278816-EC6F-A645-907D-7F25AECB1D4A}">
   <ds:schemaRefs>
-    <ds:schemaRef ds:uri="http://schemas.microsoft.com/sharepoint/v3/contenttype/forms"/>
+    <ds:schemaRef ds:uri="http://schemas.openxmlformats.org/officeDocument/2006/bibliography"/>
   </ds:schemaRefs>
 </ds:datastoreItem>
 </file>
 
-<file path=customXml/itemProps3.xml><?xml version="1.0" encoding="utf-8"?>
+<file path=customXml/itemProps4.xml><?xml version="1.0" encoding="utf-8"?>
 <ds:datastoreItem xmlns:ds="http://schemas.openxmlformats.org/officeDocument/2006/customXml" ds:itemID="{7B319A58-F8E2-4C19-94CA-2C6944BB395B}">
   <ds:schemaRefs>
     <ds:schemaRef ds:uri="http://schemas.microsoft.com/office/2006/metadata/properties"/>
@@ -25676,12 +25645,4 @@
     <ds:schemaRef ds:uri="ab9fedca-001d-4cc9-b244-d9c3be5a27d3"/>
   </ds:schemaRefs>
 </ds:datastoreItem>
-</file>
-
-<file path=customXml/itemProps4.xml><?xml version="1.0" encoding="utf-8"?>
-<ds:datastoreItem xmlns:ds="http://schemas.openxmlformats.org/officeDocument/2006/customXml" ds:itemID="{EF278816-EC6F-A645-907D-7F25AECB1D4A}">
-  <ds:schemaRefs>
-    <ds:schemaRef ds:uri="http://schemas.openxmlformats.org/officeDocument/2006/bibliography"/>
-  </ds:schemaRefs>
-</ds:datastoreItem>
 </file>
</xml_diff>